<commit_message>
Rebuild the 2 Oct weekly doc with the corrected rows
Co-Authored-By: Claude Sonnet 5 <noreply@anthropic.com>
Claude-Session: https://claude.ai/code/session_01PPwbUUWpfmtc9VHJ6fxbgv
</commit_message>
<xml_diff>
--- a/projects/sandro-weekly/Weekly updates_02_Oct_26.docx
+++ b/projects/sandro-weekly/Weekly updates_02_Oct_26.docx
@@ -303,7 +303,7 @@
                 <w:sz w:val="19"/>
                 <w:szCs w:val="19"/>
               </w:rPr>
-              <w:t xml:space="preserve">Minor revisions received (Sep 15)</w:t>
+              <w:t xml:space="preserve">In proof stage (copy edit returned to JTS)</w:t>
             </w:r>
           </w:p>
         </w:tc>
@@ -357,7 +357,7 @@
                 <w:sz w:val="19"/>
                 <w:szCs w:val="19"/>
               </w:rPr>
-              <w:t xml:space="preserve">Point-by-point response; circulate to co-authors after ISTSS</w:t>
+              <w:t xml:space="preserve">Awaiting page proofs for final author review before publication</w:t>
             </w:r>
           </w:p>
         </w:tc>
@@ -440,7 +440,7 @@
                 <w:sz w:val="19"/>
                 <w:szCs w:val="19"/>
               </w:rPr>
-              <w:t xml:space="preserve">Commercial Determinants of Armed Conflict</w:t>
+              <w:t xml:space="preserve">Commercial Determinants of Armed Conflict and the Global Arms Industry</w:t>
             </w:r>
           </w:p>
         </w:tc>
@@ -467,7 +467,7 @@
                 <w:sz w:val="19"/>
                 <w:szCs w:val="19"/>
               </w:rPr>
-              <w:t xml:space="preserve">Revise &amp; resubmit received (Sep 3); committee deems the paper important</w:t>
+              <w:t xml:space="preserve">Revised and resubmitted (Oct 1); acknowledged by the journal</w:t>
             </w:r>
           </w:p>
         </w:tc>
@@ -521,7 +521,7 @@
                 <w:sz w:val="19"/>
                 <w:szCs w:val="19"/>
               </w:rPr>
-              <w:t xml:space="preserve">Build point-by-point response and revise (8 committee points; Table 1 out; attribution request overruled); circulate to co-authors before resubmission</w:t>
+              <w:t xml:space="preserve">Awaiting editorial decision</w:t>
             </w:r>
           </w:p>
         </w:tc>
@@ -548,7 +548,7 @@
                 <w:sz w:val="19"/>
                 <w:szCs w:val="19"/>
               </w:rPr>
-              <w:t xml:space="preserve">~Oct 1 (CDoH theme issue)</w:t>
+              <w:t xml:space="preserve">~Oct 1 (CDoH theme issue) — met</w:t>
             </w:r>
           </w:p>
         </w:tc>
@@ -1398,6 +1398,170 @@
                 <w:szCs w:val="19"/>
               </w:rPr>
               <w:t xml:space="preserve">8</w:t>
+            </w:r>
+          </w:p>
+        </w:tc>
+        <w:tc>
+          <w:tcPr>
+            <w:tcW w:type="dxa" w:w="3000"/>
+            <w:tcMar>
+              <w:top w:type="dxa" w:w="60"/>
+              <w:left w:type="dxa" w:w="100"/>
+              <w:bottom w:type="dxa" w:w="60"/>
+              <w:right w:type="dxa" w:w="100"/>
+            </w:tcMar>
+          </w:tcPr>
+          <w:p>
+            <w:pPr>
+              <w:spacing w:after="0" w:line="250"/>
+            </w:pPr>
+            <w:r>
+              <w:rPr>
+                <w:rFonts w:ascii="Calibri" w:cs="Calibri" w:eastAsia="Calibri" w:hAnsi="Calibri"/>
+                <w:b w:val="false"/>
+                <w:bCs w:val="false"/>
+                <w:color w:val="1A1A1A"/>
+                <w:sz w:val="19"/>
+                <w:szCs w:val="19"/>
+              </w:rPr>
+              <w:t xml:space="preserve">"Increasing Defence Expenditure May Cost Us Our Security" (Mohammed Abba-Aji, Nason Maani)</w:t>
+            </w:r>
+          </w:p>
+        </w:tc>
+        <w:tc>
+          <w:tcPr>
+            <w:tcW w:type="dxa" w:w="1500"/>
+            <w:tcMar>
+              <w:top w:type="dxa" w:w="60"/>
+              <w:left w:type="dxa" w:w="100"/>
+              <w:bottom w:type="dxa" w:w="60"/>
+              <w:right w:type="dxa" w:w="100"/>
+            </w:tcMar>
+          </w:tcPr>
+          <w:p>
+            <w:pPr>
+              <w:spacing w:after="0" w:line="250"/>
+            </w:pPr>
+            <w:r>
+              <w:rPr>
+                <w:rFonts w:ascii="Calibri" w:cs="Calibri" w:eastAsia="Calibri" w:hAnsi="Calibri"/>
+                <w:b w:val="false"/>
+                <w:bCs w:val="false"/>
+                <w:color w:val="1A1A1A"/>
+                <w:sz w:val="19"/>
+                <w:szCs w:val="19"/>
+              </w:rPr>
+              <w:t xml:space="preserve">Accepted; COI declarations complete, with BMJ's technical editor for production</w:t>
+            </w:r>
+          </w:p>
+        </w:tc>
+        <w:tc>
+          <w:tcPr>
+            <w:tcW w:type="dxa" w:w="1550"/>
+            <w:tcMar>
+              <w:top w:type="dxa" w:w="60"/>
+              <w:left w:type="dxa" w:w="100"/>
+              <w:bottom w:type="dxa" w:w="60"/>
+              <w:right w:type="dxa" w:w="100"/>
+            </w:tcMar>
+          </w:tcPr>
+          <w:p>
+            <w:pPr>
+              <w:spacing w:after="0" w:line="250"/>
+            </w:pPr>
+            <w:r>
+              <w:rPr>
+                <w:rFonts w:ascii="Calibri" w:cs="Calibri" w:eastAsia="Calibri" w:hAnsi="Calibri"/>
+                <w:b w:val="false"/>
+                <w:bCs w:val="false"/>
+                <w:color w:val="1A1A1A"/>
+                <w:sz w:val="19"/>
+                <w:szCs w:val="19"/>
+              </w:rPr>
+              <w:t xml:space="preserve">The BMJ (climate issue)</w:t>
+            </w:r>
+          </w:p>
+        </w:tc>
+        <w:tc>
+          <w:tcPr>
+            <w:tcW w:type="dxa" w:w="2500"/>
+            <w:tcMar>
+              <w:top w:type="dxa" w:w="60"/>
+              <w:left w:type="dxa" w:w="100"/>
+              <w:bottom w:type="dxa" w:w="60"/>
+              <w:right w:type="dxa" w:w="100"/>
+            </w:tcMar>
+          </w:tcPr>
+          <w:p>
+            <w:pPr>
+              <w:spacing w:after="0" w:line="250"/>
+            </w:pPr>
+            <w:r>
+              <w:rPr>
+                <w:rFonts w:ascii="Calibri" w:cs="Calibri" w:eastAsia="Calibri" w:hAnsi="Calibri"/>
+                <w:b w:val="false"/>
+                <w:bCs w:val="false"/>
+                <w:color w:val="1A1A1A"/>
+                <w:sz w:val="19"/>
+                <w:szCs w:val="19"/>
+              </w:rPr>
+              <w:t xml:space="preserve">Awaiting proofs from the technical editor</w:t>
+            </w:r>
+          </w:p>
+        </w:tc>
+        <w:tc>
+          <w:tcPr>
+            <w:tcW w:type="dxa" w:w="1110"/>
+            <w:tcMar>
+              <w:top w:type="dxa" w:w="60"/>
+              <w:left w:type="dxa" w:w="100"/>
+              <w:bottom w:type="dxa" w:w="60"/>
+              <w:right w:type="dxa" w:w="100"/>
+            </w:tcMar>
+          </w:tcPr>
+          <w:p>
+            <w:pPr>
+              <w:spacing w:after="0" w:line="250"/>
+            </w:pPr>
+            <w:r>
+              <w:rPr>
+                <w:rFonts w:ascii="Calibri" w:cs="Calibri" w:eastAsia="Calibri" w:hAnsi="Calibri"/>
+                <w:b w:val="false"/>
+                <w:bCs w:val="false"/>
+                <w:color w:val="1A1A1A"/>
+                <w:sz w:val="19"/>
+                <w:szCs w:val="19"/>
+              </w:rPr>
+              <w:t xml:space="preserve"/>
+            </w:r>
+          </w:p>
+        </w:tc>
+      </w:tr>
+      <w:tr>
+        <w:tc>
+          <w:tcPr>
+            <w:tcW w:type="dxa" w:w="420"/>
+            <w:tcMar>
+              <w:top w:type="dxa" w:w="60"/>
+              <w:left w:type="dxa" w:w="100"/>
+              <w:bottom w:type="dxa" w:w="60"/>
+              <w:right w:type="dxa" w:w="100"/>
+            </w:tcMar>
+          </w:tcPr>
+          <w:p>
+            <w:pPr>
+              <w:spacing w:after="0" w:line="250"/>
+            </w:pPr>
+            <w:r>
+              <w:rPr>
+                <w:rFonts w:ascii="Calibri" w:cs="Calibri" w:eastAsia="Calibri" w:hAnsi="Calibri"/>
+                <w:b w:val="false"/>
+                <w:bCs w:val="false"/>
+                <w:color w:val="1A1A1A"/>
+                <w:sz w:val="19"/>
+                <w:szCs w:val="19"/>
+              </w:rPr>
+              <w:t xml:space="preserve">9</w:t>
             </w:r>
           </w:p>
         </w:tc>
@@ -3177,7 +3341,7 @@
                 <w:sz w:val="19"/>
                 <w:szCs w:val="19"/>
               </w:rPr>
-              <w:t xml:space="preserve">National survey of AI in public health practice; leading with Brownson's support, Jen Layden joined. Framed as an adoption study: individual use mapped to Shah's three tiers with a sanctioned / tolerated / unsanctioned item, ASTHO challenge categories, local health departments included</w:t>
+              <w:t xml:space="preserve">National survey of AI in public health practice; leading with Brownson's support, Jen Layden joined. Framed as an adoption study: individual use mapped to Shah's three tiers with a sanctioned / tolerated / unsanctioned item, ASTHO challenge categories, local health departments included. Met with Layden and Brownson Oct 1 — discussed next steps, presented the plan</w:t>
             </w:r>
           </w:p>
         </w:tc>
@@ -3204,7 +3368,7 @@
                 <w:sz w:val="19"/>
                 <w:szCs w:val="19"/>
               </w:rPr>
-              <w:t xml:space="preserve">One-page concept note ahead of the Oct 1, 1 PM call with Layden and Brownson</w:t>
+              <w:t xml:space="preserve">Layden and Brownson to reach out separately to ASTHO and NACCHO; concept note to follow</w:t>
             </w:r>
           </w:p>
         </w:tc>
@@ -3287,7 +3451,7 @@
                 <w:sz w:val="19"/>
                 <w:szCs w:val="19"/>
               </w:rPr>
-              <w:t xml:space="preserve">PH&amp;S confirms funding for 100 copies; School covers 100; AJ Short orders once specifics set</w:t>
+              <w:t xml:space="preserve">PH&amp;S confirms funding for 100 copies; School covers 100; books have arrived, and an A/V team will be on site</w:t>
             </w:r>
           </w:p>
         </w:tc>
@@ -3370,7 +3534,7 @@
                 <w:sz w:val="19"/>
                 <w:szCs w:val="19"/>
               </w:rPr>
-              <w:t xml:space="preserve">ISTSS Symposium</w:t>
+              <w:t xml:space="preserve">Epidemiology Matters</w:t>
             </w:r>
           </w:p>
         </w:tc>
@@ -3397,7 +3561,7 @@
                 <w:sz w:val="19"/>
                 <w:szCs w:val="19"/>
               </w:rPr>
-              <w:t xml:space="preserve">Discussant resolved: Nuha Alshabani (Albany) accepted; program office processed the change</w:t>
+              <w:t xml:space="preserve">Four external reviews received; response letter drafted in the Zimmerman format; approved by Kerry and sent to Emma at OUP</w:t>
             </w:r>
           </w:p>
         </w:tc>
@@ -3424,7 +3588,7 @@
                 <w:sz w:val="19"/>
                 <w:szCs w:val="19"/>
               </w:rPr>
-              <w:t xml:space="preserve">Held Thu Sep 24, Salon C — Nuha discussed, Mohammed presented; closed</w:t>
+              <w:t xml:space="preserve">Meeting with Kerry for next steps</w:t>
             </w:r>
           </w:p>
         </w:tc>
@@ -3480,7 +3644,7 @@
                 <w:sz w:val="19"/>
                 <w:szCs w:val="19"/>
               </w:rPr>
-              <w:t xml:space="preserve">Epidemiology Matters</w:t>
+              <w:t xml:space="preserve">St. Louis SHINE Survey</w:t>
             </w:r>
           </w:p>
         </w:tc>
@@ -3507,7 +3671,7 @@
                 <w:sz w:val="19"/>
                 <w:szCs w:val="19"/>
               </w:rPr>
-              <w:t xml:space="preserve">Four external reviews received; response letter drafted in the Zimmerman format</w:t>
+              <w:t xml:space="preserve">NORC sent incentive proposal; Morven following up; no meeting needed this week</w:t>
             </w:r>
           </w:p>
         </w:tc>
@@ -3534,7 +3698,7 @@
                 <w:sz w:val="19"/>
                 <w:szCs w:val="19"/>
               </w:rPr>
-              <w:t xml:space="preserve">Response letter with Kerry + Sandro (sent Sep 22); next to Emma at OUP</w:t>
+              <w:t xml:space="preserve">Pilot data collection</w:t>
             </w:r>
           </w:p>
         </w:tc>
@@ -3590,7 +3754,7 @@
                 <w:sz w:val="19"/>
                 <w:szCs w:val="19"/>
               </w:rPr>
-              <w:t xml:space="preserve">St. Louis SHINE Survey</w:t>
+              <w:t xml:space="preserve">MaRVIN dissertation on primary care implementation in Nigeria</w:t>
             </w:r>
           </w:p>
         </w:tc>
@@ -3617,7 +3781,7 @@
                 <w:sz w:val="19"/>
                 <w:szCs w:val="19"/>
               </w:rPr>
-              <w:t xml:space="preserve">NORC sent incentive proposal; Morven following up; no meeting needed this week</w:t>
+              <w:t xml:space="preserve">Saidat and Jaimie shaping dissertation</w:t>
             </w:r>
           </w:p>
         </w:tc>
@@ -3644,7 +3808,7 @@
                 <w:sz w:val="19"/>
                 <w:szCs w:val="19"/>
               </w:rPr>
-              <w:t xml:space="preserve">Pilot data collection</w:t>
+              <w:t xml:space="preserve">Committee; timelines</w:t>
             </w:r>
           </w:p>
         </w:tc>
@@ -3700,7 +3864,7 @@
                 <w:sz w:val="19"/>
                 <w:szCs w:val="19"/>
               </w:rPr>
-              <w:t xml:space="preserve">MaRVIN dissertation on primary care implementation in Nigeria</w:t>
+              <w:t xml:space="preserve">MaRVIN Second Wave</w:t>
             </w:r>
           </w:p>
         </w:tc>
@@ -3727,7 +3891,7 @@
                 <w:sz w:val="19"/>
                 <w:szCs w:val="19"/>
               </w:rPr>
-              <w:t xml:space="preserve">Saidat and Jaimie shaping dissertation</w:t>
+              <w:t xml:space="preserve">Met with AFENET; participant recruitment and cost</w:t>
             </w:r>
           </w:p>
         </w:tc>
@@ -3754,7 +3918,7 @@
                 <w:sz w:val="19"/>
                 <w:szCs w:val="19"/>
               </w:rPr>
-              <w:t xml:space="preserve">Committee; timelines</w:t>
+              <w:t xml:space="preserve">Awaiting budget / revisions</w:t>
             </w:r>
           </w:p>
         </w:tc>
@@ -3810,7 +3974,7 @@
                 <w:sz w:val="19"/>
                 <w:szCs w:val="19"/>
               </w:rPr>
-              <w:t xml:space="preserve">MaRVIN Second Wave</w:t>
+              <w:t xml:space="preserve">Rural Health Task Force</w:t>
             </w:r>
           </w:p>
         </w:tc>
@@ -3837,7 +4001,7 @@
                 <w:sz w:val="19"/>
                 <w:szCs w:val="19"/>
               </w:rPr>
-              <w:t xml:space="preserve">Met with AFENET; participant recruitment and cost</w:t>
+              <w:t xml:space="preserve">White paper drafting underway; writing assignments distributed</w:t>
             </w:r>
           </w:p>
         </w:tc>
@@ -3864,7 +4028,7 @@
                 <w:sz w:val="19"/>
                 <w:szCs w:val="19"/>
               </w:rPr>
-              <w:t xml:space="preserve">Awaiting budget / revisions</w:t>
+              <w:t xml:space="preserve">Updating analysis with new data; drafting part of the landscape report</w:t>
             </w:r>
           </w:p>
         </w:tc>
@@ -3920,7 +4084,7 @@
                 <w:sz w:val="19"/>
                 <w:szCs w:val="19"/>
               </w:rPr>
-              <w:t xml:space="preserve">Rural Health Task Force</w:t>
+              <w:t xml:space="preserve">AI &amp; Digital Innovation in Public Health Curriculum (MPH)</w:t>
             </w:r>
           </w:p>
         </w:tc>
@@ -3947,7 +4111,7 @@
                 <w:sz w:val="19"/>
                 <w:szCs w:val="19"/>
               </w:rPr>
-              <w:t xml:space="preserve">White paper drafting underway; writing assignments distributed</w:t>
+              <w:t xml:space="preserve">Kick-off meeting held</w:t>
             </w:r>
           </w:p>
         </w:tc>
@@ -3974,7 +4138,7 @@
                 <w:sz w:val="19"/>
                 <w:szCs w:val="19"/>
               </w:rPr>
-              <w:t xml:space="preserve">Section first draft due Sep 20; reconvene Sep 25</w:t>
+              <w:t xml:space="preserve">Course concept</w:t>
             </w:r>
           </w:p>
         </w:tc>
@@ -4030,7 +4194,7 @@
                 <w:sz w:val="19"/>
                 <w:szCs w:val="19"/>
               </w:rPr>
-              <w:t xml:space="preserve">AI &amp; Digital Innovation in Public Health Curriculum (MPH)</w:t>
+              <w:t xml:space="preserve">Lancet Global Gun Violence Commission</w:t>
             </w:r>
           </w:p>
         </w:tc>
@@ -4057,7 +4221,7 @@
                 <w:sz w:val="19"/>
                 <w:szCs w:val="19"/>
               </w:rPr>
-              <w:t xml:space="preserve">Kick-off meeting held</w:t>
+              <w:t xml:space="preserve">Working-group synthesis completed; feedback received this week</w:t>
             </w:r>
           </w:p>
         </w:tc>
@@ -4084,117 +4248,7 @@
                 <w:sz w:val="19"/>
                 <w:szCs w:val="19"/>
               </w:rPr>
-              <w:t xml:space="preserve">Course concept</w:t>
-            </w:r>
-          </w:p>
-        </w:tc>
-      </w:tr>
-      <w:tr>
-        <w:tc>
-          <w:tcPr>
-            <w:tcW w:type="dxa" w:w="420"/>
-            <w:tcMar>
-              <w:top w:type="dxa" w:w="60"/>
-              <w:left w:type="dxa" w:w="100"/>
-              <w:bottom w:type="dxa" w:w="60"/>
-              <w:right w:type="dxa" w:w="100"/>
-            </w:tcMar>
-          </w:tcPr>
-          <w:p>
-            <w:pPr>
-              <w:spacing w:after="0" w:line="250"/>
-            </w:pPr>
-            <w:r>
-              <w:rPr>
-                <w:rFonts w:ascii="Calibri" w:cs="Calibri" w:eastAsia="Calibri" w:hAnsi="Calibri"/>
-                <w:b w:val="false"/>
-                <w:bCs w:val="false"/>
-                <w:color w:val="1A1A1A"/>
-                <w:sz w:val="19"/>
-                <w:szCs w:val="19"/>
-              </w:rPr>
-              <w:t xml:space="preserve">10</w:t>
-            </w:r>
-          </w:p>
-        </w:tc>
-        <w:tc>
-          <w:tcPr>
-            <w:tcW w:type="dxa" w:w="2100"/>
-            <w:tcMar>
-              <w:top w:type="dxa" w:w="60"/>
-              <w:left w:type="dxa" w:w="100"/>
-              <w:bottom w:type="dxa" w:w="60"/>
-              <w:right w:type="dxa" w:w="100"/>
-            </w:tcMar>
-          </w:tcPr>
-          <w:p>
-            <w:pPr>
-              <w:spacing w:after="0" w:line="250"/>
-            </w:pPr>
-            <w:r>
-              <w:rPr>
-                <w:rFonts w:ascii="Calibri" w:cs="Calibri" w:eastAsia="Calibri" w:hAnsi="Calibri"/>
-                <w:b w:val="false"/>
-                <w:bCs w:val="false"/>
-                <w:color w:val="1A1A1A"/>
-                <w:sz w:val="19"/>
-                <w:szCs w:val="19"/>
-              </w:rPr>
-              <w:t xml:space="preserve">Lancet Global Gun Violence Commission</w:t>
-            </w:r>
-          </w:p>
-        </w:tc>
-        <w:tc>
-          <w:tcPr>
-            <w:tcW w:type="dxa" w:w="4200"/>
-            <w:tcMar>
-              <w:top w:type="dxa" w:w="60"/>
-              <w:left w:type="dxa" w:w="100"/>
-              <w:bottom w:type="dxa" w:w="60"/>
-              <w:right w:type="dxa" w:w="100"/>
-            </w:tcMar>
-          </w:tcPr>
-          <w:p>
-            <w:pPr>
-              <w:spacing w:after="0" w:line="250"/>
-            </w:pPr>
-            <w:r>
-              <w:rPr>
-                <w:rFonts w:ascii="Calibri" w:cs="Calibri" w:eastAsia="Calibri" w:hAnsi="Calibri"/>
-                <w:b w:val="false"/>
-                <w:bCs w:val="false"/>
-                <w:color w:val="1A1A1A"/>
-                <w:sz w:val="19"/>
-                <w:szCs w:val="19"/>
-              </w:rPr>
-              <w:t xml:space="preserve">Working-group synthesis completed</w:t>
-            </w:r>
-          </w:p>
-        </w:tc>
-        <w:tc>
-          <w:tcPr>
-            <w:tcW w:type="dxa" w:w="3360"/>
-            <w:tcMar>
-              <w:top w:type="dxa" w:w="60"/>
-              <w:left w:type="dxa" w:w="100"/>
-              <w:bottom w:type="dxa" w:w="60"/>
-              <w:right w:type="dxa" w:w="100"/>
-            </w:tcMar>
-          </w:tcPr>
-          <w:p>
-            <w:pPr>
-              <w:spacing w:after="0" w:line="250"/>
-            </w:pPr>
-            <w:r>
-              <w:rPr>
-                <w:rFonts w:ascii="Calibri" w:cs="Calibri" w:eastAsia="Calibri" w:hAnsi="Calibri"/>
-                <w:b w:val="false"/>
-                <w:bCs w:val="false"/>
-                <w:color w:val="1A1A1A"/>
-                <w:sz w:val="19"/>
-                <w:szCs w:val="19"/>
-              </w:rPr>
-              <w:t xml:space="preserve">Awaiting further instruction</w:t>
+              <w:t xml:space="preserve">Meeting with Aisha next week for next steps</w:t>
             </w:r>
           </w:p>
         </w:tc>

</xml_diff>